<commit_message>
Director: optimistic update Resolver, ConsultaExpedientes: boton actualizar, fix finalizados/archivados, fix upload documentos
</commit_message>
<xml_diff>
--- a/correcciones.docx
+++ b/correcciones.docx
@@ -10,53 +10,25 @@
         <w:t>✅</w:t>
       </w:r>
       <w:r>
-        <w:t xml:space="preserve"> 1- Sacar del </w:t>
-      </w:r>
-      <w:proofErr w:type="spellStart"/>
-      <w:r>
-        <w:t>header</w:t>
-      </w:r>
-      <w:proofErr w:type="spellEnd"/>
-      <w:r>
-        <w:t xml:space="preserve"> el Usuario activo - Nombre que aparece, no tiene que decir nada.</w:t>
+        <w:t xml:space="preserve"> 1- Sacar del header el Usuario activo - Nombre que aparece, no tiene que decir nada.</w:t>
       </w:r>
     </w:p>
     <w:p/>
     <w:p>
       <w:r>
-        <w:t xml:space="preserve">2- En el </w:t>
-      </w:r>
-      <w:proofErr w:type="spellStart"/>
-      <w:r>
-        <w:t>login</w:t>
-      </w:r>
-      <w:proofErr w:type="spellEnd"/>
-      <w:r>
-        <w:t xml:space="preserve"> poner el "Olvide contraseña", y de </w:t>
-      </w:r>
-      <w:proofErr w:type="spellStart"/>
-      <w:r>
-        <w:t>ahi</w:t>
-      </w:r>
-      <w:proofErr w:type="spellEnd"/>
-      <w:r>
-        <w:t xml:space="preserve"> ver si se resetea esa clave y queda el </w:t>
-      </w:r>
-      <w:proofErr w:type="spellStart"/>
-      <w:r>
-        <w:t>dni</w:t>
-      </w:r>
-      <w:proofErr w:type="spellEnd"/>
-      <w:r>
-        <w:t xml:space="preserve"> del usuario o probar con la plataforma de </w:t>
-      </w:r>
-      <w:proofErr w:type="spellStart"/>
-      <w:r>
-        <w:t>martin</w:t>
-      </w:r>
-      <w:proofErr w:type="spellEnd"/>
-      <w:r>
-        <w:t xml:space="preserve">  </w:t>
+        <w:rPr>
+          <w:rFonts w:ascii="Segoe UI Emoji" w:hAnsi="Segoe UI Emoji" w:cs="Segoe UI Emoji"/>
+        </w:rPr>
+        <w:t>✅</w:t>
+      </w:r>
+      <w:r>
+        <w:t>--</w:t>
+      </w:r>
+      <w:r>
+        <w:t xml:space="preserve">2- En el login poner el "Olvide contraseña", y de ahi ver si se resetea esa clave y queda el dni del usuario o probar con la plataforma de martin  </w:t>
+      </w:r>
+      <w:r>
+        <w:t>(incompleto, falta probar el reseteo de la clave)</w:t>
       </w:r>
     </w:p>
     <w:p/>
@@ -68,23 +40,7 @@
         <w:t>✅</w:t>
       </w:r>
       <w:r>
-        <w:t xml:space="preserve"> 3- En el </w:t>
-      </w:r>
-      <w:proofErr w:type="spellStart"/>
-      <w:r>
-        <w:t>header</w:t>
-      </w:r>
-      <w:proofErr w:type="spellEnd"/>
-      <w:r>
-        <w:t xml:space="preserve"> donde dice DPA que sea un enlace a la </w:t>
-      </w:r>
-      <w:proofErr w:type="spellStart"/>
-      <w:r>
-        <w:t>pagina</w:t>
-      </w:r>
-      <w:proofErr w:type="spellEnd"/>
-      <w:r>
-        <w:t xml:space="preserve"> de la DPA</w:t>
+        <w:t xml:space="preserve"> 3- En el header donde dice DPA que sea un enlace a la pagina de la DPA</w:t>
       </w:r>
     </w:p>
     <w:p/>
@@ -96,15 +52,7 @@
         <w:t>❌</w:t>
       </w:r>
       <w:r>
-        <w:t xml:space="preserve"> 4- En el </w:t>
-      </w:r>
-      <w:proofErr w:type="spellStart"/>
-      <w:r>
-        <w:t>login</w:t>
-      </w:r>
-      <w:proofErr w:type="spellEnd"/>
-      <w:r>
-        <w:t xml:space="preserve"> en los campos agregar que diga aparezca un asterisco y que diga "campos obligatorios"</w:t>
+        <w:t xml:space="preserve"> 4- En el login en los campos agregar que diga aparezca un asterisco y que diga "campos obligatorios"</w:t>
       </w:r>
     </w:p>
     <w:p>
@@ -133,53 +81,22 @@
         <w:t>✅</w:t>
       </w:r>
       <w:r>
-        <w:t xml:space="preserve"> 6- En el usuario Administrador, en el panel sacar los botones de Expedientes archivados, expedientes finalizados y </w:t>
-      </w:r>
-      <w:proofErr w:type="spellStart"/>
-      <w:r>
-        <w:t>gestion</w:t>
-      </w:r>
-      <w:proofErr w:type="spellEnd"/>
-      <w:r>
-        <w:t xml:space="preserve"> de firmas </w:t>
+        <w:t xml:space="preserve"> 6- En el usuario Administrador, en el panel sacar los botones de Expedientes archivados, expedientes finalizados y gestion de firmas </w:t>
       </w:r>
     </w:p>
     <w:p/>
     <w:p>
       <w:r>
-        <w:t xml:space="preserve">7- En el </w:t>
-      </w:r>
-      <w:proofErr w:type="spellStart"/>
-      <w:r>
-        <w:t>boton</w:t>
-      </w:r>
-      <w:proofErr w:type="spellEnd"/>
-      <w:r>
-        <w:t xml:space="preserve"> Consultar y asignar" poner los botones Expedientes en </w:t>
-      </w:r>
-      <w:proofErr w:type="spellStart"/>
-      <w:r>
-        <w:t>Revision</w:t>
-      </w:r>
-      <w:proofErr w:type="spellEnd"/>
-      <w:r>
-        <w:t xml:space="preserve">, expedientes Finalizados y </w:t>
-      </w:r>
-      <w:proofErr w:type="spellStart"/>
-      <w:r>
-        <w:t>expendientes</w:t>
-      </w:r>
-      <w:proofErr w:type="spellEnd"/>
-      <w:r>
-        <w:t xml:space="preserve"> archivados. Y que cada uno muestre los datos del expediente en </w:t>
-      </w:r>
-      <w:proofErr w:type="spellStart"/>
-      <w:r>
-        <w:t>cuestion</w:t>
-      </w:r>
-      <w:proofErr w:type="spellEnd"/>
-      <w:r>
-        <w:t xml:space="preserve"> (filtros) y que permita hacer un reporte que se pueda imprimir o descargar.</w:t>
+        <w:rPr>
+          <w:rFonts w:ascii="Segoe UI Emoji" w:hAnsi="Segoe UI Emoji" w:cs="Segoe UI Emoji"/>
+        </w:rPr>
+        <w:t>✅</w:t>
+      </w:r>
+      <w:r>
+        <w:t>-</w:t>
+      </w:r>
+      <w:r>
+        <w:t>7- En el boton Consultar y asignar" poner los botones Expedientes en Revision, expedientes Finalizados y expendientes archivados. Y que cada uno muestre los datos del expediente en cuestion (filtros) y que permita hacer un reporte que se pueda imprimir o descargar.</w:t>
       </w:r>
     </w:p>
     <w:p/>
@@ -193,6 +110,15 @@
       <w:r>
         <w:t xml:space="preserve"> 8- Notificar al presentante de cada pase que se realiza en el expediente.  </w:t>
       </w:r>
+      <w:r>
+        <w:t xml:space="preserve">(Complicado. </w:t>
+      </w:r>
+      <w:r>
+        <w:t xml:space="preserve">Se enviaron algunos pero es un poco tedioso, </w:t>
+      </w:r>
+      <w:r>
+        <w:t>lo mejor seria enviar un mail al finalizar el proceso de aprobación o rechazo)</w:t>
+      </w:r>
     </w:p>
     <w:p/>
     <w:p>
@@ -203,15 +129,7 @@
         <w:t>✅</w:t>
       </w:r>
       <w:r>
-        <w:t xml:space="preserve"> 9- Notificar al presentante de la </w:t>
-      </w:r>
-      <w:proofErr w:type="spellStart"/>
-      <w:r>
-        <w:t>resolucion</w:t>
-      </w:r>
-      <w:proofErr w:type="spellEnd"/>
-      <w:r>
-        <w:t xml:space="preserve"> de su expediente.</w:t>
+        <w:t xml:space="preserve"> 9- Notificar al presentante de la resolucion de su expediente.</w:t>
       </w:r>
     </w:p>
     <w:p/>
@@ -223,128 +141,71 @@
     <w:p/>
     <w:p>
       <w:r>
-        <w:t xml:space="preserve">11- Cuando alguien consulte un </w:t>
-      </w:r>
-      <w:proofErr w:type="spellStart"/>
-      <w:r>
-        <w:t>expdiente</w:t>
-      </w:r>
-      <w:proofErr w:type="spellEnd"/>
-      <w:r>
-        <w:t xml:space="preserve"> debe poder ver un registro que informe quien lo </w:t>
-      </w:r>
-      <w:proofErr w:type="spellStart"/>
-      <w:r>
-        <w:t>recepciono</w:t>
-      </w:r>
-      <w:proofErr w:type="spellEnd"/>
-      <w:r>
-        <w:t>, fecha y hora, y el orden de los pases.</w:t>
+        <w:t>11- Cuando alguien consulte un expdiente debe poder ver un registro que informe quien lo recepciono, fecha y hora, y el orden de los pases.</w:t>
       </w:r>
     </w:p>
     <w:p/>
     <w:p>
       <w:r>
-        <w:t xml:space="preserve">12. Dejar la </w:t>
-      </w:r>
-      <w:proofErr w:type="spellStart"/>
-      <w:r>
-        <w:t>opcion</w:t>
-      </w:r>
-      <w:proofErr w:type="spellEnd"/>
-      <w:r>
-        <w:t xml:space="preserve"> de todos los usuarios cuando sean pases</w:t>
+        <w:rPr>
+          <w:rFonts w:ascii="Segoe UI Emoji" w:hAnsi="Segoe UI Emoji" w:cs="Segoe UI Emoji"/>
+        </w:rPr>
+        <w:t>✅</w:t>
+      </w:r>
+      <w:r>
+        <w:t xml:space="preserve"> Dejar la opcion de todos los usuarios cuando sean pases</w:t>
+      </w:r>
+      <w:r>
+        <w:t xml:space="preserve"> (Se puso la oopcion de deshacer pase para que no haya confusiones)</w:t>
       </w:r>
     </w:p>
     <w:p/>
     <w:p>
       <w:r>
-        <w:t xml:space="preserve">13- Corregir en el usuario administrativo en el desplegable que solo aparezca la </w:t>
-      </w:r>
-      <w:proofErr w:type="spellStart"/>
-      <w:r>
-        <w:t>opcion</w:t>
-      </w:r>
-      <w:proofErr w:type="spellEnd"/>
-      <w:r>
-        <w:t xml:space="preserve"> del usuario </w:t>
-      </w:r>
-      <w:proofErr w:type="spellStart"/>
-      <w:r>
-        <w:t>tecnico</w:t>
-      </w:r>
-      <w:proofErr w:type="spellEnd"/>
-      <w:r>
-        <w:t>, ver desplegable del cambiar estado</w:t>
+        <w:rPr>
+          <w:rFonts w:ascii="Segoe UI Emoji" w:hAnsi="Segoe UI Emoji" w:cs="Segoe UI Emoji"/>
+        </w:rPr>
+        <w:lastRenderedPageBreak/>
+        <w:t>✅</w:t>
+      </w:r>
+      <w:r>
+        <w:t>- Corregir en el usuario administrativo en el desplegable que solo aparezca la opcion del usuario tecnico, ver desplegable del cambiar estado</w:t>
       </w:r>
     </w:p>
     <w:p/>
     <w:p>
       <w:r>
-        <w:t xml:space="preserve">14- Corregir del usuario director en el modal de </w:t>
-      </w:r>
-      <w:proofErr w:type="spellStart"/>
-      <w:r>
-        <w:t>revision</w:t>
-      </w:r>
-      <w:proofErr w:type="spellEnd"/>
-      <w:r>
-        <w:t xml:space="preserve"> que los aprobados se vayan directamente al </w:t>
-      </w:r>
-      <w:proofErr w:type="spellStart"/>
-      <w:r>
-        <w:t>boton</w:t>
-      </w:r>
-      <w:proofErr w:type="spellEnd"/>
-      <w:r>
-        <w:t xml:space="preserve"> de finalizados o archivados</w:t>
+        <w:t>14- Corregir del usuario director en el modal de revision que los aprobados se vayan directamente al boton de finalizados o archivados</w:t>
       </w:r>
     </w:p>
     <w:p/>
     <w:p>
       <w:r>
-        <w:t xml:space="preserve">15- En usuario </w:t>
-      </w:r>
-      <w:proofErr w:type="spellStart"/>
-      <w:r>
-        <w:t>tecnico</w:t>
-      </w:r>
-      <w:proofErr w:type="spellEnd"/>
-      <w:r>
-        <w:t xml:space="preserve"> en bandeja de entrada corregir la </w:t>
-      </w:r>
-      <w:proofErr w:type="spellStart"/>
-      <w:r>
-        <w:t>funcion</w:t>
-      </w:r>
-      <w:proofErr w:type="spellEnd"/>
-      <w:r>
-        <w:t xml:space="preserve"> Ver</w:t>
-      </w:r>
-    </w:p>
-    <w:p>
-      <w:r>
-        <w:t xml:space="preserve">16- </w:t>
-      </w:r>
-      <w:proofErr w:type="gramStart"/>
-      <w:r>
-        <w:t>técnico :</w:t>
-      </w:r>
-      <w:proofErr w:type="gramEnd"/>
-      <w:r>
-        <w:t xml:space="preserve"> </w:t>
-      </w:r>
-      <w:r>
-        <w:t xml:space="preserve">No muestra </w:t>
-      </w:r>
-      <w:proofErr w:type="gramStart"/>
-      <w:r>
-        <w:t>alguna columnas</w:t>
-      </w:r>
-      <w:proofErr w:type="gramEnd"/>
-    </w:p>
-    <w:p>
-      <w:r>
+        <w:rPr>
+          <w:rFonts w:ascii="Segoe UI Emoji" w:hAnsi="Segoe UI Emoji" w:cs="Segoe UI Emoji"/>
+        </w:rPr>
+        <w:t>✅</w:t>
+      </w:r>
+      <w:r>
+        <w:t>- En usuario tecnico en bandeja de entrada corregir la funcion Ver</w:t>
+      </w:r>
+    </w:p>
+    <w:p>
+      <w:r>
+        <w:rPr>
+          <w:rFonts w:ascii="Segoe UI Emoji" w:hAnsi="Segoe UI Emoji" w:cs="Segoe UI Emoji"/>
+        </w:rPr>
+        <w:t>✅</w:t>
+      </w:r>
+      <w:r>
+        <w:t>- técnico : No muestra alguna columnas</w:t>
+      </w:r>
+    </w:p>
+    <w:p>
+      <w:r>
+        <w:rPr>
+          <w:noProof/>
+        </w:rPr>
         <w:drawing>
           <wp:inline distT="0" distB="0" distL="0" distR="0" wp14:anchorId="179F337A" wp14:editId="4D3AF2E7">
             <wp:extent cx="6645910" cy="942340"/>
@@ -384,28 +245,21 @@
     </w:p>
     <w:p>
       <w:r>
-        <w:t xml:space="preserve">17- </w:t>
-      </w:r>
-      <w:proofErr w:type="spellStart"/>
-      <w:r>
-        <w:t>Tecnico</w:t>
-      </w:r>
-      <w:proofErr w:type="spellEnd"/>
-      <w:r>
-        <w:t xml:space="preserve">- antes de presionar </w:t>
-      </w:r>
-      <w:proofErr w:type="spellStart"/>
-      <w:r>
-        <w:t>recepcionar</w:t>
-      </w:r>
-      <w:proofErr w:type="spellEnd"/>
-      <w:r>
-        <w:t xml:space="preserve"> se puede realizar el pase y todo lo demás sin hacer la recepción</w:t>
-      </w:r>
-    </w:p>
-    <w:p>
-      <w:r>
-        <w:t>18- a donde se muestra la observación</w:t>
+        <w:t>17- Tecnico- antes de presionar recepcionar se puede realizar el pase y todo lo demás sin hacer la recepción</w:t>
+      </w:r>
+    </w:p>
+    <w:p>
+      <w:r>
+        <w:rPr>
+          <w:rFonts w:ascii="Segoe UI Emoji" w:hAnsi="Segoe UI Emoji" w:cs="Segoe UI Emoji"/>
+        </w:rPr>
+        <w:t>✅</w:t>
+      </w:r>
+      <w:r>
+        <w:t>- a donde se muestra la observación</w:t>
+      </w:r>
+      <w:r>
+        <w:t xml:space="preserve"> (la observación se muestra en el presentante y en todos los modal de los usuarios)</w:t>
       </w:r>
     </w:p>
     <w:p>
@@ -465,28 +319,24 @@
     </w:p>
     <w:p>
       <w:r>
-        <w:t xml:space="preserve">19- </w:t>
-      </w:r>
-      <w:proofErr w:type="spellStart"/>
-      <w:r>
-        <w:t>Tecnico</w:t>
-      </w:r>
-      <w:proofErr w:type="spellEnd"/>
-      <w:r>
-        <w:t xml:space="preserve">: en el botón </w:t>
-      </w:r>
-      <w:proofErr w:type="spellStart"/>
-      <w:r>
-        <w:t>docs</w:t>
-      </w:r>
-      <w:proofErr w:type="spellEnd"/>
-      <w:r>
-        <w:t xml:space="preserve"> </w:t>
+        <w:rPr>
+          <w:rFonts w:ascii="Segoe UI Emoji" w:hAnsi="Segoe UI Emoji" w:cs="Segoe UI Emoji"/>
+        </w:rPr>
+        <w:t>✅</w:t>
+      </w:r>
+      <w:r>
+        <w:t xml:space="preserve">19- Tecnico: en el botón docs </w:t>
+      </w:r>
+      <w:r>
+        <w:t>(se arreglo colocando el boto ver)</w:t>
       </w:r>
       <w:r>
         <w:br/>
       </w:r>
       <w:r>
+        <w:rPr>
+          <w:noProof/>
+        </w:rPr>
         <w:drawing>
           <wp:inline distT="0" distB="0" distL="0" distR="0" wp14:anchorId="7F753C5A" wp14:editId="7A0461C2">
             <wp:extent cx="3619500" cy="2986624"/>
@@ -526,23 +376,39 @@
     </w:p>
     <w:p>
       <w:r>
+        <w:rPr>
+          <w:rFonts w:ascii="Segoe UI Emoji" w:hAnsi="Segoe UI Emoji" w:cs="Segoe UI Emoji"/>
+        </w:rPr>
+        <w:lastRenderedPageBreak/>
+        <w:t>✅</w:t>
+      </w:r>
+      <w:r>
+        <w:rPr>
+          <w:rFonts w:ascii="Segoe UI Emoji" w:hAnsi="Segoe UI Emoji" w:cs="Segoe UI Emoji"/>
+        </w:rPr>
+        <w:t xml:space="preserve"> </w:t>
+      </w:r>
+      <w:r>
         <w:t>Donde se muestra el archivo q sube el técnico y el comentario. Teniendo en cuenta q comentario de observaciones generales se muestra en el presentante.</w:t>
       </w:r>
-    </w:p>
-    <w:p>
-      <w:r>
-        <w:lastRenderedPageBreak/>
-        <w:t xml:space="preserve">20- </w:t>
-      </w:r>
-      <w:proofErr w:type="spellStart"/>
-      <w:r>
-        <w:t>Tecnico</w:t>
-      </w:r>
-      <w:proofErr w:type="spellEnd"/>
-      <w:r>
-        <w:t xml:space="preserve">: </w:t>
-      </w:r>
-      <w:r>
+      <w:r>
+        <w:t>( se muestra en el presentante y en todos los modales de los usuarios, es acumulativo)</w:t>
+      </w:r>
+    </w:p>
+    <w:p>
+      <w:r>
+        <w:rPr>
+          <w:rFonts w:ascii="Segoe UI Emoji" w:hAnsi="Segoe UI Emoji" w:cs="Segoe UI Emoji"/>
+        </w:rPr>
+        <w:t>✅</w:t>
+      </w:r>
+      <w:r>
+        <w:t xml:space="preserve">20- Tecnico: </w:t>
+      </w:r>
+      <w:r>
+        <w:rPr>
+          <w:noProof/>
+        </w:rPr>
         <w:drawing>
           <wp:inline distT="0" distB="0" distL="0" distR="0" wp14:anchorId="43C1168A" wp14:editId="5698220C">
             <wp:extent cx="6645910" cy="1823720"/>
@@ -581,27 +447,29 @@
       </w:r>
     </w:p>
     <w:p>
-      <w:proofErr w:type="gramStart"/>
       <w:r>
         <w:t>En tipo no muestra nada y en estado tendría q mostrar asignado?</w:t>
       </w:r>
-      <w:proofErr w:type="gramEnd"/>
-    </w:p>
-    <w:p>
-      <w:r>
-        <w:t xml:space="preserve">21- </w:t>
-      </w:r>
-      <w:proofErr w:type="spellStart"/>
-      <w:r>
-        <w:t>Tecnico</w:t>
-      </w:r>
-      <w:proofErr w:type="spellEnd"/>
-      <w:r>
-        <w:t xml:space="preserve">: </w:t>
-      </w:r>
-    </w:p>
-    <w:p>
-      <w:r>
+      <w:r>
+        <w:t xml:space="preserve"> (corregido)</w:t>
+      </w:r>
+    </w:p>
+    <w:p>
+      <w:r>
+        <w:rPr>
+          <w:rFonts w:ascii="Segoe UI Emoji" w:hAnsi="Segoe UI Emoji" w:cs="Segoe UI Emoji"/>
+        </w:rPr>
+        <w:t>✅</w:t>
+      </w:r>
+      <w:r>
+        <w:t xml:space="preserve">- Tecnico: </w:t>
+      </w:r>
+    </w:p>
+    <w:p>
+      <w:r>
+        <w:rPr>
+          <w:noProof/>
+        </w:rPr>
         <w:drawing>
           <wp:inline distT="0" distB="0" distL="0" distR="0" wp14:anchorId="05BEC0E4" wp14:editId="0F16C9C5">
             <wp:extent cx="4838510" cy="1800225"/>
@@ -643,22 +511,32 @@
       <w:r>
         <w:t>En descripción no muestra nada</w:t>
       </w:r>
-    </w:p>
-    <w:p>
-      <w:r>
-        <w:t xml:space="preserve">21- </w:t>
-      </w:r>
-      <w:proofErr w:type="spellStart"/>
-      <w:r>
-        <w:t>Tecnico</w:t>
-      </w:r>
-      <w:proofErr w:type="spellEnd"/>
-      <w:r>
-        <w:t xml:space="preserve"> falta agregar manual</w:t>
-      </w:r>
-    </w:p>
-    <w:p>
-      <w:r>
+      <w:r>
+        <w:t xml:space="preserve"> (corregido)</w:t>
+      </w:r>
+    </w:p>
+    <w:p>
+      <w:r>
+        <w:rPr>
+          <w:rFonts w:ascii="Segoe UI Emoji" w:hAnsi="Segoe UI Emoji" w:cs="Segoe UI Emoji"/>
+        </w:rPr>
+        <w:t>✅</w:t>
+      </w:r>
+      <w:r>
+        <w:t>-</w:t>
+      </w:r>
+      <w:r>
+        <w:t xml:space="preserve"> </w:t>
+      </w:r>
+      <w:r>
+        <w:t>21- Tecnico falta agregar manual</w:t>
+      </w:r>
+    </w:p>
+    <w:p>
+      <w:r>
+        <w:rPr>
+          <w:noProof/>
+        </w:rPr>
         <w:drawing>
           <wp:inline distT="0" distB="0" distL="0" distR="0" wp14:anchorId="038D2ED6" wp14:editId="02BDA3B4">
             <wp:extent cx="3581498" cy="1162050"/>
@@ -698,15 +576,13 @@
     </w:p>
     <w:p>
       <w:r>
-        <w:t xml:space="preserve">22- </w:t>
-      </w:r>
-      <w:proofErr w:type="spellStart"/>
-      <w:r>
-        <w:t>Tecnico</w:t>
-      </w:r>
-      <w:proofErr w:type="spellEnd"/>
-      <w:r>
-        <w:t>:</w:t>
+        <w:rPr>
+          <w:rFonts w:ascii="Segoe UI Emoji" w:hAnsi="Segoe UI Emoji" w:cs="Segoe UI Emoji"/>
+        </w:rPr>
+        <w:t>✅</w:t>
+      </w:r>
+      <w:r>
+        <w:t>- Tecnico:</w:t>
       </w:r>
     </w:p>
     <w:p>
@@ -715,6 +591,9 @@
         <w:t xml:space="preserve"> </w:t>
       </w:r>
       <w:r>
+        <w:rPr>
+          <w:noProof/>
+        </w:rPr>
         <w:drawing>
           <wp:inline distT="0" distB="0" distL="0" distR="0" wp14:anchorId="4EE2E71A" wp14:editId="36FD8BCC">
             <wp:extent cx="3593613" cy="3124200"/>
@@ -755,6 +634,25 @@
     <w:p>
       <w:r>
         <w:t>Donde se muestra el archivo y la observación.</w:t>
+      </w:r>
+      <w:r>
+        <w:t>(corregido)</w:t>
+      </w:r>
+    </w:p>
+    <w:p/>
+    <w:p>
+      <w:r>
+        <w:t>22 -Ver que el usuario director, apruebe o rechace un expediente y que se vaya del panel resolver el expediente y luego que aparezca en archivos finalizados o rechazados del usuario administrativo.</w:t>
+      </w:r>
+    </w:p>
+    <w:p>
+      <w:r>
+        <w:t>23- Ver que cambie el estado (aprobado o rechazo) y que el presentante cuando haga la consulta le figure en la columna APROBADO O RECHAZADO</w:t>
+      </w:r>
+    </w:p>
+    <w:p>
+      <w:r>
+        <w:t>24- Ver bien la lógica de deshacer pase</w:t>
       </w:r>
     </w:p>
     <w:p/>

</xml_diff>